<commit_message>
update content to fix broken elements
</commit_message>
<xml_diff>
--- a/03_Outputs/avatar_scripts_final/en/Module 3/3.1.0-en.docx
+++ b/03_Outputs/avatar_scripts_final/en/Module 3/3.1.0-en.docx
@@ -4,21 +4,13 @@
   <w:body>
     <w:p>
       <w:pPr>
-        <w:rPr>
-          <w:rFonts w:ascii="Cambria" w:hAnsi="Cambria" w:eastAsia="Cambria" w:cs="Cambria"/>
-          <w:b w:val="0"/>
-          <w:bCs w:val="0"/>
-          <w:noProof w:val="0"/>
-          <w:sz w:val="22"/>
-          <w:szCs w:val="22"/>
-          <w:lang w:val="en-US"/>
-        </w:rPr>
+        <w:spacing w:before="240" w:beforeAutospacing="off" w:after="240" w:afterAutospacing="off"/>
       </w:pPr>
       <w:r>
         <w:rPr>
           <w:rFonts w:ascii="Cambria" w:hAnsi="Cambria" w:eastAsia="Cambria" w:cs="Cambria"/>
-          <w:b w:val="0"/>
-          <w:bCs w:val="0"/>
+          <w:b w:val="1"/>
+          <w:bCs w:val="1"/>
           <w:noProof w:val="0"/>
           <w:sz w:val="22"/>
           <w:szCs w:val="22"/>
@@ -29,320 +21,114 @@
     </w:p>
     <w:p>
       <w:pPr>
+        <w:spacing w:before="240" w:beforeAutospacing="off" w:after="240" w:afterAutospacing="off"/>
+      </w:pPr>
+      <w:r>
         <w:rPr>
           <w:rFonts w:ascii="Cambria" w:hAnsi="Cambria" w:eastAsia="Cambria" w:cs="Cambria"/>
-          <w:b w:val="0"/>
-          <w:bCs w:val="0"/>
           <w:noProof w:val="0"/>
           <w:sz w:val="22"/>
           <w:szCs w:val="22"/>
           <w:lang w:val="en-US"/>
         </w:rPr>
+        <w:t>Energy systems worldwide are undergoing profound change. Climate urgency and falling renewable costs have made the energy transition central to global policy and investment. The decade from 2020 to 2030 is decisive for limiting warming to 1.5°C, with today’s choices shaping energy for generations.</w:t>
+      </w:r>
+    </w:p>
+    <w:p>
+      <w:pPr>
+        <w:spacing w:before="240" w:beforeAutospacing="off" w:after="240" w:afterAutospacing="off"/>
       </w:pPr>
       <w:r>
         <w:rPr>
           <w:rFonts w:ascii="Cambria" w:hAnsi="Cambria" w:eastAsia="Cambria" w:cs="Cambria"/>
-          <w:b w:val="0"/>
-          <w:bCs w:val="0"/>
           <w:noProof w:val="0"/>
           <w:sz w:val="22"/>
           <w:szCs w:val="22"/>
           <w:lang w:val="en-US"/>
         </w:rPr>
-        <w:t xml:space="preserve">Across the world, energy systems are undergoing profound change. The urgency of climate change, together with falling costs for renewable technologies, has placed energy transition at the center of global policy and investment. Climate scientists stress that the decade from </w:t>
+        <w:t>Progress is accelerating. In 2024, more than gigawatts of renewable power were added—the largest annual increase on record. Solar and wind lead this growth, supported by advances in storage and grids. Fossil fuels are steadily giving way to cleaner sources.</w:t>
       </w:r>
+    </w:p>
+    <w:p>
+      <w:pPr>
+        <w:spacing w:before="240" w:beforeAutospacing="off" w:after="240" w:afterAutospacing="off"/>
+      </w:pPr>
       <w:r>
         <w:rPr>
           <w:rFonts w:ascii="Cambria" w:hAnsi="Cambria" w:eastAsia="Cambria" w:cs="Cambria"/>
-          <w:b w:val="0"/>
-          <w:bCs w:val="0"/>
           <w:noProof w:val="0"/>
           <w:sz w:val="22"/>
           <w:szCs w:val="22"/>
           <w:lang w:val="en-US"/>
         </w:rPr>
-        <w:t>2020</w:t>
+        <w:t xml:space="preserve">A </w:t>
       </w:r>
       <w:r>
         <w:rPr>
           <w:rFonts w:ascii="Cambria" w:hAnsi="Cambria" w:eastAsia="Cambria" w:cs="Cambria"/>
-          <w:b w:val="0"/>
-          <w:bCs w:val="0"/>
+          <w:i w:val="1"/>
+          <w:iCs w:val="1"/>
           <w:noProof w:val="0"/>
           <w:sz w:val="22"/>
           <w:szCs w:val="22"/>
           <w:lang w:val="en-US"/>
         </w:rPr>
-        <w:t xml:space="preserve"> to </w:t>
+        <w:t>just transition</w:t>
       </w:r>
       <w:r>
         <w:rPr>
           <w:rFonts w:ascii="Cambria" w:hAnsi="Cambria" w:eastAsia="Cambria" w:cs="Cambria"/>
-          <w:b w:val="0"/>
-          <w:bCs w:val="0"/>
           <w:noProof w:val="0"/>
           <w:sz w:val="22"/>
           <w:szCs w:val="22"/>
           <w:lang w:val="en-US"/>
         </w:rPr>
-        <w:t>2030</w:t>
+        <w:t xml:space="preserve"> ensures this shift is environmentally sustainable, socially inclusive, and economically fair. It addresses past inequities by supporting workers and communities dependent on fossil fuels, while ensuring the benefits of clean energy—jobs, health, affordable access—reach all, especially those historically left behind.</w:t>
       </w:r>
+    </w:p>
+    <w:p>
+      <w:pPr>
+        <w:spacing w:before="240" w:beforeAutospacing="off" w:after="240" w:afterAutospacing="off"/>
+      </w:pPr>
       <w:r>
         <w:rPr>
           <w:rFonts w:ascii="Cambria" w:hAnsi="Cambria" w:eastAsia="Cambria" w:cs="Cambria"/>
-          <w:b w:val="0"/>
-          <w:bCs w:val="0"/>
           <w:noProof w:val="0"/>
           <w:sz w:val="22"/>
           <w:szCs w:val="22"/>
           <w:lang w:val="en-US"/>
         </w:rPr>
-        <w:t xml:space="preserve"> will be decisive in limiting global warming to one point five degrees Celsius, and the actions taken during these years will shape the future of energy for generations.</w:t>
+        <w:t>Strong governance is critical. Beyond building infrastructure, policies and institutions must anticipate risks and share opportunities equitably. This includes workforce training, debt-sensitive finance for developing countries, and community participation in decisions.</w:t>
       </w:r>
     </w:p>
     <w:p>
       <w:pPr>
+        <w:spacing w:before="240" w:beforeAutospacing="off" w:after="240" w:afterAutospacing="off"/>
+      </w:pPr>
+      <w:r>
         <w:rPr>
           <w:rFonts w:ascii="Cambria" w:hAnsi="Cambria" w:eastAsia="Cambria" w:cs="Cambria"/>
-          <w:b w:val="0"/>
-          <w:bCs w:val="0"/>
           <w:noProof w:val="0"/>
           <w:sz w:val="22"/>
           <w:szCs w:val="22"/>
           <w:lang w:val="en-US"/>
         </w:rPr>
+        <w:t>Challenges are greatest in the Global South, where countries must reduce fossil reliance while expanding electricity access and managing land and water pressures. Many also aim to capture opportunities in critical minerals and renewable industries—goals requiring ambitious, context-specific strategies.</w:t>
+      </w:r>
+    </w:p>
+    <w:p>
+      <w:pPr>
+        <w:spacing w:before="240" w:beforeAutospacing="off" w:after="240" w:afterAutospacing="off"/>
       </w:pPr>
       <w:r>
         <w:rPr>
           <w:rFonts w:ascii="Cambria" w:hAnsi="Cambria" w:eastAsia="Cambria" w:cs="Cambria"/>
-          <w:b w:val="0"/>
-          <w:bCs w:val="0"/>
           <w:noProof w:val="0"/>
           <w:sz w:val="22"/>
           <w:szCs w:val="22"/>
           <w:lang w:val="en-US"/>
         </w:rPr>
-        <w:t xml:space="preserve">Recent data shows the pace of progress. In </w:t>
-      </w:r>
-      <w:r>
-        <w:rPr>
-          <w:rFonts w:ascii="Cambria" w:hAnsi="Cambria" w:eastAsia="Cambria" w:cs="Cambria"/>
-          <w:b w:val="0"/>
-          <w:bCs w:val="0"/>
-          <w:noProof w:val="0"/>
-          <w:sz w:val="22"/>
-          <w:szCs w:val="22"/>
-          <w:lang w:val="en-US"/>
-        </w:rPr>
-        <w:t>2024</w:t>
-      </w:r>
-      <w:r>
-        <w:rPr>
-          <w:rFonts w:ascii="Cambria" w:hAnsi="Cambria" w:eastAsia="Cambria" w:cs="Cambria"/>
-          <w:b w:val="0"/>
-          <w:bCs w:val="0"/>
-          <w:noProof w:val="0"/>
-          <w:sz w:val="22"/>
-          <w:szCs w:val="22"/>
-          <w:lang w:val="en-US"/>
-        </w:rPr>
-        <w:t>, about seven hundred forty gigawatts of renewable power capacity were added worldwide. This was the largest annual increase ever recorded. Solar and wind power lead this growth, supported by advances in storage technologies and grid integration. These developments mark a structural change in the energy mix, with fossil fuels steadily giving way to cleaner sources.</w:t>
-      </w:r>
-    </w:p>
-    <w:p>
-      <w:pPr>
-        <w:rPr>
-          <w:rFonts w:ascii="Cambria" w:hAnsi="Cambria" w:eastAsia="Cambria" w:cs="Cambria"/>
-          <w:b w:val="0"/>
-          <w:bCs w:val="0"/>
-          <w:noProof w:val="0"/>
-          <w:sz w:val="22"/>
-          <w:szCs w:val="22"/>
-          <w:lang w:val="en-US"/>
-        </w:rPr>
-      </w:pPr>
-      <w:r>
-        <w:rPr>
-          <w:rFonts w:ascii="Cambria" w:hAnsi="Cambria" w:eastAsia="Cambria" w:cs="Cambria"/>
-          <w:b w:val="0"/>
-          <w:bCs w:val="0"/>
-          <w:noProof w:val="0"/>
-          <w:sz w:val="22"/>
-          <w:szCs w:val="22"/>
-          <w:lang w:val="en-US"/>
-        </w:rPr>
-        <w:t xml:space="preserve">The concept of a </w:t>
-      </w:r>
-      <w:r>
-        <w:rPr>
-          <w:rFonts w:ascii="Cambria" w:hAnsi="Cambria" w:eastAsia="Cambria" w:cs="Cambria"/>
-          <w:b w:val="0"/>
-          <w:bCs w:val="0"/>
-          <w:noProof w:val="0"/>
-          <w:sz w:val="22"/>
-          <w:szCs w:val="22"/>
-          <w:lang w:val="en-US"/>
-        </w:rPr>
-        <w:t>just energy transition</w:t>
-      </w:r>
-      <w:r>
-        <w:rPr>
-          <w:rFonts w:ascii="Cambria" w:hAnsi="Cambria" w:eastAsia="Cambria" w:cs="Cambria"/>
-          <w:b w:val="0"/>
-          <w:bCs w:val="0"/>
-          <w:noProof w:val="0"/>
-          <w:sz w:val="22"/>
-          <w:szCs w:val="22"/>
-          <w:lang w:val="en-US"/>
-        </w:rPr>
-        <w:t xml:space="preserve"> is central to understanding this shift. It refers to managing the move away from fossil fuels in a way that is environmentally sustainable, socially inclusive, and economically fair. It </w:t>
-      </w:r>
-      <w:r>
-        <w:rPr>
-          <w:rFonts w:ascii="Cambria" w:hAnsi="Cambria" w:eastAsia="Cambria" w:cs="Cambria"/>
-          <w:b w:val="0"/>
-          <w:bCs w:val="0"/>
-          <w:noProof w:val="0"/>
-          <w:sz w:val="22"/>
-          <w:szCs w:val="22"/>
-          <w:lang w:val="en-US"/>
-        </w:rPr>
-        <w:t>seeks</w:t>
-      </w:r>
-      <w:r>
-        <w:rPr>
-          <w:rFonts w:ascii="Cambria" w:hAnsi="Cambria" w:eastAsia="Cambria" w:cs="Cambria"/>
-          <w:b w:val="0"/>
-          <w:bCs w:val="0"/>
-          <w:noProof w:val="0"/>
-          <w:sz w:val="22"/>
-          <w:szCs w:val="22"/>
-          <w:lang w:val="en-US"/>
-        </w:rPr>
-        <w:t xml:space="preserve"> to correct the imbalances of past energy transitions, where the benefits and burdens were unevenly distributed. A just transition requires planning for workers and communities whose livelihoods depend on fossil fuels, while also ensuring that the benefits of cleaner energy—such as improved health, new employment, and affordable access—reach all groups, especially those historically left behind.</w:t>
-      </w:r>
-    </w:p>
-    <w:p>
-      <w:pPr>
-        <w:rPr>
-          <w:rFonts w:ascii="Cambria" w:hAnsi="Cambria" w:eastAsia="Cambria" w:cs="Cambria"/>
-          <w:b w:val="0"/>
-          <w:bCs w:val="0"/>
-          <w:noProof w:val="0"/>
-          <w:sz w:val="22"/>
-          <w:szCs w:val="22"/>
-          <w:lang w:val="en-US"/>
-        </w:rPr>
-      </w:pPr>
-      <w:r>
-        <w:rPr>
-          <w:rFonts w:ascii="Cambria" w:hAnsi="Cambria" w:eastAsia="Cambria" w:cs="Cambria"/>
-          <w:b w:val="0"/>
-          <w:bCs w:val="0"/>
-          <w:noProof w:val="0"/>
-          <w:sz w:val="22"/>
-          <w:szCs w:val="22"/>
-          <w:lang w:val="en-US"/>
-        </w:rPr>
-        <w:t xml:space="preserve">Strong governance is essential to make this possible. Energy transition is not only a matter of installing solar panels or building wind farms. It also requires policies, institutions, and regulations that </w:t>
-      </w:r>
-      <w:r>
-        <w:rPr>
-          <w:rFonts w:ascii="Cambria" w:hAnsi="Cambria" w:eastAsia="Cambria" w:cs="Cambria"/>
-          <w:b w:val="0"/>
-          <w:bCs w:val="0"/>
-          <w:noProof w:val="0"/>
-          <w:sz w:val="22"/>
-          <w:szCs w:val="22"/>
-          <w:lang w:val="en-US"/>
-        </w:rPr>
-        <w:t>anticipate</w:t>
-      </w:r>
-      <w:r>
-        <w:rPr>
-          <w:rFonts w:ascii="Cambria" w:hAnsi="Cambria" w:eastAsia="Cambria" w:cs="Cambria"/>
-          <w:b w:val="0"/>
-          <w:bCs w:val="0"/>
-          <w:noProof w:val="0"/>
-          <w:sz w:val="22"/>
-          <w:szCs w:val="22"/>
-          <w:lang w:val="en-US"/>
-        </w:rPr>
-        <w:t xml:space="preserve"> risks and share opportunities equitably. Examples include long-term workforce training, financial support for developing countries that reduces reliance on debt, and participatory decision-making that gives communities a meaningful voice.</w:t>
-      </w:r>
-    </w:p>
-    <w:p>
-      <w:pPr>
-        <w:rPr>
-          <w:rFonts w:ascii="Cambria" w:hAnsi="Cambria" w:eastAsia="Cambria" w:cs="Cambria"/>
-          <w:b w:val="0"/>
-          <w:bCs w:val="0"/>
-          <w:noProof w:val="0"/>
-          <w:sz w:val="22"/>
-          <w:szCs w:val="22"/>
-          <w:lang w:val="en-US"/>
-        </w:rPr>
-      </w:pPr>
-      <w:r>
-        <w:rPr>
-          <w:rFonts w:ascii="Cambria" w:hAnsi="Cambria" w:eastAsia="Cambria" w:cs="Cambria"/>
-          <w:b w:val="0"/>
-          <w:bCs w:val="0"/>
-          <w:noProof w:val="0"/>
-          <w:sz w:val="22"/>
-          <w:szCs w:val="22"/>
-          <w:lang w:val="en-US"/>
-        </w:rPr>
-        <w:t xml:space="preserve">Challenges are especially complex in the Global South. Many countries must reduce dependence on fossil fuels while also expanding electricity access and managing pressures on land and water. At the same time, they are </w:t>
-      </w:r>
-      <w:r>
-        <w:rPr>
-          <w:rFonts w:ascii="Cambria" w:hAnsi="Cambria" w:eastAsia="Cambria" w:cs="Cambria"/>
-          <w:b w:val="0"/>
-          <w:bCs w:val="0"/>
-          <w:noProof w:val="0"/>
-          <w:sz w:val="22"/>
-          <w:szCs w:val="22"/>
-          <w:lang w:val="en-US"/>
-        </w:rPr>
-        <w:t>seeking</w:t>
-      </w:r>
-      <w:r>
-        <w:rPr>
-          <w:rFonts w:ascii="Cambria" w:hAnsi="Cambria" w:eastAsia="Cambria" w:cs="Cambria"/>
-          <w:b w:val="0"/>
-          <w:bCs w:val="0"/>
-          <w:noProof w:val="0"/>
-          <w:sz w:val="22"/>
-          <w:szCs w:val="22"/>
-          <w:lang w:val="en-US"/>
-        </w:rPr>
-        <w:t xml:space="preserve"> to capture economic opportunities through the development of industries around critical minerals and renewable manufacturing. These goals require strategies that are both ambitious and tailored to each national context.</w:t>
-      </w:r>
-    </w:p>
-    <w:p>
-      <w:pPr>
-        <w:rPr>
-          <w:rFonts w:ascii="Cambria" w:hAnsi="Cambria" w:eastAsia="Cambria" w:cs="Cambria"/>
-          <w:b w:val="0"/>
-          <w:bCs w:val="0"/>
-          <w:noProof w:val="0"/>
-          <w:sz w:val="22"/>
-          <w:szCs w:val="22"/>
-          <w:lang w:val="en-US"/>
-        </w:rPr>
-      </w:pPr>
-      <w:r>
-        <w:rPr>
-          <w:rFonts w:ascii="Cambria" w:hAnsi="Cambria" w:eastAsia="Cambria" w:cs="Cambria"/>
-          <w:b w:val="0"/>
-          <w:bCs w:val="0"/>
-          <w:noProof w:val="0"/>
-          <w:sz w:val="22"/>
-          <w:szCs w:val="22"/>
-          <w:lang w:val="en-US"/>
-        </w:rPr>
-        <w:t>This chapter will introduce the main drivers of the global energy transition, the key actors shaping it, and the reasons why equity and social inclusion are now considered essential elements of energy policy. This foundation will prepare you to explore in greater depth the opportunities and trade-offs that define the just energy transition.</w:t>
+        <w:t>This chapter introduces the main drivers of the global energy transition, the actors shaping it, and why equity and inclusion are now core to energy policy. It lays the foundation for exploring the opportunities and trade-offs of a just transition.</w:t>
       </w:r>
     </w:p>
     <w:p>

</xml_diff>